<commit_message>
Add sample PDF inputs, scripts, and miscellaneous project artifacts.
Include Version3 reference PDFs, create_version4 script, probe notes, and minor Version1/Version3 doc updates.

Co-authored-by: Cursor <cursoragent@cursor.com>
</commit_message>
<xml_diff>
--- a/Version1/docs/Estimator_ReadingDrawings&Calculations.docx
+++ b/Version1/docs/Estimator_ReadingDrawings&Calculations.docx
@@ -60,7 +60,7 @@
         <w:rPr>
           <w:lang w:val="en-US"/>
         </w:rPr>
-        <w:t>2</w:t>
+        <w:t>3</w:t>
       </w:r>
       <w:r>
         <w:rPr>
@@ -202,19 +202,7 @@
         <w:rPr>
           <w:lang w:val="en-US"/>
         </w:rPr>
-        <w:t>. Analyze</w:t>
-      </w:r>
-      <w:r>
-        <w:rPr>
-          <w:lang w:val="en-US"/>
-        </w:rPr>
-        <w:t xml:space="preserve"> this file completely</w:t>
-      </w:r>
-      <w:r>
-        <w:rPr>
-          <w:lang w:val="en-US"/>
-        </w:rPr>
-        <w:t xml:space="preserve">. </w:t>
+        <w:t xml:space="preserve">. Analyze this file completely. </w:t>
       </w:r>
     </w:p>
     <w:p>
@@ -671,10 +659,7 @@
     <w:p>
       <w:pPr>
         <w:pStyle w:val="ListParagraph"/>
-        <w:numPr>
-          <w:ilvl w:val="1"/>
-          <w:numId w:val="1"/>
-        </w:numPr>
+        <w:ind w:left="1440"/>
         <w:rPr>
           <w:lang w:val="en-US"/>
         </w:rPr>
@@ -818,9 +803,30 @@
       <w:pPr>
         <w:pStyle w:val="ListParagraph"/>
         <w:numPr>
-          <w:ilvl w:val="1"/>
+          <w:ilvl w:val="0"/>
           <w:numId w:val="1"/>
         </w:numPr>
+        <w:rPr>
+          <w:lang w:val="en-US"/>
+        </w:rPr>
+      </w:pPr>
+      <w:r>
+        <w:rPr>
+          <w:lang w:val="en-US"/>
+        </w:rPr>
+        <w:t>R</w:t>
+      </w:r>
+      <w:r>
+        <w:rPr>
+          <w:lang w:val="en-US"/>
+        </w:rPr>
+        <w:t>einforcement plan /drawings</w:t>
+      </w:r>
+    </w:p>
+    <w:p>
+      <w:pPr>
+        <w:pStyle w:val="ListParagraph"/>
+        <w:ind w:left="1440"/>
         <w:rPr>
           <w:lang w:val="en-US"/>
         </w:rPr>
@@ -1160,13 +1166,7 @@
         <w:rPr>
           <w:lang w:val="en-US"/>
         </w:rPr>
-        <w:t xml:space="preserve">2Y-20 = </w:t>
-      </w:r>
-      <w:r>
-        <w:rPr>
-          <w:lang w:val="en-US"/>
-        </w:rPr>
-        <w:t>2 Number of Bars with Diameter 16mm</w:t>
+        <w:t>2Y-20 = 2 Number of Bars with Diameter 16mm</w:t>
       </w:r>
     </w:p>
     <w:p>
@@ -1184,25 +1184,7 @@
         <w:rPr>
           <w:lang w:val="en-US"/>
         </w:rPr>
-        <w:t>4Y-8 = 4</w:t>
-      </w:r>
-      <w:r>
-        <w:rPr>
-          <w:lang w:val="en-US"/>
-        </w:rPr>
-        <w:t xml:space="preserve"> Number of Bars with Diameter </w:t>
-      </w:r>
-      <w:r>
-        <w:rPr>
-          <w:lang w:val="en-US"/>
-        </w:rPr>
-        <w:t>8</w:t>
-      </w:r>
-      <w:r>
-        <w:rPr>
-          <w:lang w:val="en-US"/>
-        </w:rPr>
-        <w:t>mm</w:t>
+        <w:t>4Y-8 = 4 Number of Bars with Diameter 8mm</w:t>
       </w:r>
     </w:p>
     <w:p>
@@ -1257,55 +1239,7 @@
         <w:rPr>
           <w:lang w:val="en-US"/>
         </w:rPr>
-        <w:t>2L-Y</w:t>
-      </w:r>
-      <w:r>
-        <w:rPr>
-          <w:lang w:val="en-US"/>
-        </w:rPr>
-        <w:t>8</w:t>
-      </w:r>
-      <w:r>
-        <w:rPr>
-          <w:lang w:val="en-US"/>
-        </w:rPr>
-        <w:t>@1</w:t>
-      </w:r>
-      <w:r>
-        <w:rPr>
-          <w:lang w:val="en-US"/>
-        </w:rPr>
-        <w:t>5</w:t>
-      </w:r>
-      <w:r>
-        <w:rPr>
-          <w:lang w:val="en-US"/>
-        </w:rPr>
-        <w:t xml:space="preserve">0C/C = 2-Legged stirrups with diameter </w:t>
-      </w:r>
-      <w:r>
-        <w:rPr>
-          <w:lang w:val="en-US"/>
-        </w:rPr>
-        <w:t>8</w:t>
-      </w:r>
-      <w:r>
-        <w:rPr>
-          <w:lang w:val="en-US"/>
-        </w:rPr>
-        <w:t>mm placed 1</w:t>
-      </w:r>
-      <w:r>
-        <w:rPr>
-          <w:lang w:val="en-US"/>
-        </w:rPr>
-        <w:t>5</w:t>
-      </w:r>
-      <w:r>
-        <w:rPr>
-          <w:lang w:val="en-US"/>
-        </w:rPr>
-        <w:t xml:space="preserve">0mm all along the beam. </w:t>
+        <w:t xml:space="preserve">2L-Y8@150C/C = 2-Legged stirrups with diameter 8mm placed 150mm all along the beam. </w:t>
       </w:r>
     </w:p>
     <w:p>
@@ -1342,19 +1276,7 @@
         <w:rPr>
           <w:lang w:val="en-US"/>
         </w:rPr>
-        <w:t xml:space="preserve">2L-Y8@100/200/100C/C = </w:t>
-      </w:r>
-      <w:r>
-        <w:rPr>
-          <w:lang w:val="en-US"/>
-        </w:rPr>
-        <w:t>2-Legged stirrups with diameter 8mm placed</w:t>
-      </w:r>
-      <w:r>
-        <w:rPr>
-          <w:lang w:val="en-US"/>
-        </w:rPr>
-        <w:t xml:space="preserve"> </w:t>
+        <w:t xml:space="preserve">2L-Y8@100/200/100C/C = 2-Legged stirrups with diameter 8mm placed </w:t>
       </w:r>
       <w:r>
         <w:rPr>
@@ -1422,19 +1344,7 @@
         <w:rPr>
           <w:lang w:val="en-US"/>
         </w:rPr>
-        <w:t>1</w:t>
-      </w:r>
-      <w:r>
-        <w:rPr>
-          <w:lang w:val="en-US"/>
-        </w:rPr>
-        <w:t>0</w:t>
-      </w:r>
-      <w:r>
-        <w:rPr>
-          <w:lang w:val="en-US"/>
-        </w:rPr>
-        <w:t xml:space="preserve">0mm </w:t>
+        <w:t xml:space="preserve">100mm </w:t>
       </w:r>
       <w:r>
         <w:rPr>
@@ -1561,13 +1471,7 @@
         <w:rPr>
           <w:lang w:val="en-US"/>
         </w:rPr>
-        <w:t xml:space="preserve">In Beam5(B5) </w:t>
-      </w:r>
-      <w:r>
-        <w:rPr>
-          <w:lang w:val="en-US"/>
-        </w:rPr>
-        <w:t>- 2150 = Clear length of Top bar – extra</w:t>
+        <w:t>In Beam5(B5) - 2150 = Clear length of Top bar – extra</w:t>
       </w:r>
     </w:p>
     <w:p>
@@ -1585,13 +1489,7 @@
         <w:rPr>
           <w:lang w:val="en-US"/>
         </w:rPr>
-        <w:t xml:space="preserve">In Beam5(B5) </w:t>
-      </w:r>
-      <w:r>
-        <w:rPr>
-          <w:lang w:val="en-US"/>
-        </w:rPr>
-        <w:t xml:space="preserve">– 500 = Clear length of Bottom bar – extra to be deducted(subtracted) from Clear length of Bottom bar so that we can arrive at Clear length of Bottom bar- extra. </w:t>
+        <w:t xml:space="preserve">In Beam5(B5) – 500 = Clear length of Bottom bar – extra to be deducted(subtracted) from Clear length of Bottom bar so that we can arrive at Clear length of Bottom bar- extra. </w:t>
       </w:r>
     </w:p>
     <w:p>
@@ -1609,31 +1507,7 @@
         <w:rPr>
           <w:lang w:val="en-US"/>
         </w:rPr>
-        <w:t>In Beam</w:t>
-      </w:r>
-      <w:r>
-        <w:rPr>
-          <w:lang w:val="en-US"/>
-        </w:rPr>
-        <w:t>4</w:t>
-      </w:r>
-      <w:r>
-        <w:rPr>
-          <w:lang w:val="en-US"/>
-        </w:rPr>
-        <w:t>(B</w:t>
-      </w:r>
-      <w:r>
-        <w:rPr>
-          <w:lang w:val="en-US"/>
-        </w:rPr>
-        <w:t>4</w:t>
-      </w:r>
-      <w:r>
-        <w:rPr>
-          <w:lang w:val="en-US"/>
-        </w:rPr>
-        <w:t>) - 2150 = Clear length of Top bar – extra</w:t>
+        <w:t>In Beam4(B4) - 2150 = Clear length of Top bar – extra</w:t>
       </w:r>
     </w:p>
     <w:p>
@@ -1652,31 +1526,7 @@
           <w:lang w:val="en-US"/>
         </w:rPr>
         <w:lastRenderedPageBreak/>
-        <w:t>In Beam</w:t>
-      </w:r>
-      <w:r>
-        <w:rPr>
-          <w:lang w:val="en-US"/>
-        </w:rPr>
-        <w:t>4</w:t>
-      </w:r>
-      <w:r>
-        <w:rPr>
-          <w:lang w:val="en-US"/>
-        </w:rPr>
-        <w:t>(B</w:t>
-      </w:r>
-      <w:r>
-        <w:rPr>
-          <w:lang w:val="en-US"/>
-        </w:rPr>
-        <w:t>4</w:t>
-      </w:r>
-      <w:r>
-        <w:rPr>
-          <w:lang w:val="en-US"/>
-        </w:rPr>
-        <w:t xml:space="preserve">) – 500 = Clear length of Bottom bar – extra to be deducted(subtracted) from Clear length of Bottom bar so that we can arrive at Clear length of Bottom bar- extra. </w:t>
+        <w:t xml:space="preserve">In Beam4(B4) – 500 = Clear length of Bottom bar – extra to be deducted(subtracted) from Clear length of Bottom bar so that we can arrive at Clear length of Bottom bar- extra. </w:t>
       </w:r>
     </w:p>
     <w:p>
@@ -2706,25 +2556,7 @@
         <w:rPr>
           <w:lang w:val="en-US"/>
         </w:rPr>
-        <w:t xml:space="preserve">Width and depth of Beam - </w:t>
-      </w:r>
-      <w:r>
-        <w:rPr>
-          <w:lang w:val="en-US"/>
-        </w:rPr>
-        <w:t>To be</w:t>
-      </w:r>
-      <w:r>
-        <w:rPr>
-          <w:lang w:val="en-US"/>
-        </w:rPr>
-        <w:t xml:space="preserve"> extracted</w:t>
-      </w:r>
-      <w:r>
-        <w:rPr>
-          <w:lang w:val="en-US"/>
-        </w:rPr>
-        <w:t xml:space="preserve"> directly from Framing Plan</w:t>
+        <w:t>Width and depth of Beam - To be extracted directly from Framing Plan</w:t>
       </w:r>
     </w:p>
     <w:p>

</xml_diff>

<commit_message>
feat(Version9): Phase M.2 spacer rule engine + QA.2A port (9.1.0)
Add deterministic SPACER_BAR injection at R.1.3, VB1 cut-length guard for SPACER role, Version9 QA.2A runner/package, and supporting docs from the accuracy track.

Co-authored-by: Cursor <cursoragent@cursor.com>
</commit_message>
<xml_diff>
--- a/Version1/docs/Estimator_ReadingDrawings&Calculations.docx
+++ b/Version1/docs/Estimator_ReadingDrawings&Calculations.docx
@@ -1,6 +1,6 @@
 
 <file path=word/document.xml><?xml version="1.0" encoding="utf-8"?>
-<w:document xmlns:wpc="http://schemas.microsoft.com/office/word/2010/wordprocessingCanvas" xmlns:cx="http://schemas.microsoft.com/office/drawing/2014/chartex" xmlns:cx1="http://schemas.microsoft.com/office/drawing/2015/9/8/chartex" xmlns:cx2="http://schemas.microsoft.com/office/drawing/2015/10/21/chartex" xmlns:cx3="http://schemas.microsoft.com/office/drawing/2016/5/9/chartex" xmlns:cx4="http://schemas.microsoft.com/office/drawing/2016/5/10/chartex" xmlns:cx5="http://schemas.microsoft.com/office/drawing/2016/5/11/chartex" xmlns:cx6="http://schemas.microsoft.com/office/drawing/2016/5/12/chartex" xmlns:cx7="http://schemas.microsoft.com/office/drawing/2016/5/13/chartex" xmlns:cx8="http://schemas.microsoft.com/office/drawing/2016/5/14/chartex" xmlns:mc="http://schemas.openxmlformats.org/markup-compatibility/2006" xmlns:aink="http://schemas.microsoft.com/office/drawing/2016/ink" xmlns:am3d="http://schemas.microsoft.com/office/drawing/2017/model3d" xmlns:o="urn:schemas-microsoft-com:office:office" xmlns:oel="http://schemas.microsoft.com/office/2019/extlst" xmlns:r="http://schemas.openxmlformats.org/officeDocument/2006/relationships" xmlns:m="http://schemas.openxmlformats.org/officeDocument/2006/math" xmlns:v="urn:schemas-microsoft-com:vml" xmlns:wp14="http://schemas.microsoft.com/office/word/2010/wordprocessingDrawing" xmlns:wp="http://schemas.openxmlformats.org/drawingml/2006/wordprocessingDrawing" xmlns:w10="urn:schemas-microsoft-com:office:word" xmlns:w="http://schemas.openxmlformats.org/wordprocessingml/2006/main" xmlns:w14="http://schemas.microsoft.com/office/word/2010/wordml" xmlns:w15="http://schemas.microsoft.com/office/word/2012/wordml" xmlns:w16cex="http://schemas.microsoft.com/office/word/2018/wordml/cex" xmlns:w16cid="http://schemas.microsoft.com/office/word/2016/wordml/cid" xmlns:w16="http://schemas.microsoft.com/office/word/2018/wordml" xmlns:w16du="http://schemas.microsoft.com/office/word/2023/wordml/word16du" xmlns:w16sdtdh="http://schemas.microsoft.com/office/word/2020/wordml/sdtdatahash" xmlns:w16sdtfl="http://schemas.microsoft.com/office/word/2024/wordml/sdtformatlock" xmlns:w16se="http://schemas.microsoft.com/office/word/2015/wordml/symex" xmlns:wpg="http://schemas.microsoft.com/office/word/2010/wordprocessingGroup" xmlns:wpi="http://schemas.microsoft.com/office/word/2010/wordprocessingInk" xmlns:wne="http://schemas.microsoft.com/office/word/2006/wordml" xmlns:wps="http://schemas.microsoft.com/office/word/2010/wordprocessingShape" mc:Ignorable="w14 w15 w16se w16cid w16 w16cex w16sdtdh w16sdtfl w16du wp14">
+<w:document xmlns:wpc="http://schemas.microsoft.com/office/word/2010/wordprocessingCanvas" xmlns:cx="http://schemas.microsoft.com/office/drawing/2014/chartex" xmlns:cx1="http://schemas.microsoft.com/office/drawing/2015/9/8/chartex" xmlns:cx2="http://schemas.microsoft.com/office/drawing/2015/10/21/chartex" xmlns:cx3="http://schemas.microsoft.com/office/drawing/2016/5/9/chartex" xmlns:cx4="http://schemas.microsoft.com/office/drawing/2016/5/10/chartex" xmlns:cx5="http://schemas.microsoft.com/office/drawing/2016/5/11/chartex" xmlns:cx6="http://schemas.microsoft.com/office/drawing/2016/5/12/chartex" xmlns:cx7="http://schemas.microsoft.com/office/drawing/2016/5/13/chartex" xmlns:cx8="http://schemas.microsoft.com/office/drawing/2016/5/14/chartex" xmlns:mc="http://schemas.openxmlformats.org/markup-compatibility/2006" xmlns:aink="http://schemas.microsoft.com/office/drawing/2016/ink" xmlns:am3d="http://schemas.microsoft.com/office/drawing/2017/model3d" xmlns:o="urn:schemas-microsoft-com:office:office" xmlns:oel="http://schemas.microsoft.com/office/2019/extlst" xmlns:r="http://schemas.openxmlformats.org/officeDocument/2006/relationships" xmlns:m="http://schemas.openxmlformats.org/officeDocument/2006/math" xmlns:v="urn:schemas-microsoft-com:vml" xmlns:wp14="http://schemas.microsoft.com/office/word/2010/wordprocessingDrawing" xmlns:wp="http://schemas.openxmlformats.org/drawingml/2006/wordprocessingDrawing" xmlns:w10="urn:schemas-microsoft-com:office:word" xmlns:w="http://schemas.openxmlformats.org/wordprocessingml/2006/main" xmlns:w14="http://schemas.microsoft.com/office/word/2010/wordml" xmlns:w15="http://schemas.microsoft.com/office/word/2012/wordml" xmlns:w16cei="http://schemas.microsoft.com/office/word/2026/wordml/cei" xmlns:w16cex="http://schemas.microsoft.com/office/word/2018/wordml/cex" xmlns:w16cid="http://schemas.microsoft.com/office/word/2016/wordml/cid" xmlns:w16="http://schemas.microsoft.com/office/word/2018/wordml" xmlns:w16du="http://schemas.microsoft.com/office/word/2023/wordml/word16du" xmlns:w16sdtdh="http://schemas.microsoft.com/office/word/2020/wordml/sdtdatahash" xmlns:w16sdtfl="http://schemas.microsoft.com/office/word/2024/wordml/sdtformatlock" xmlns:w16se="http://schemas.microsoft.com/office/word/2015/wordml/symex" xmlns:wpg="http://schemas.microsoft.com/office/word/2010/wordprocessingGroup" xmlns:wpi="http://schemas.microsoft.com/office/word/2010/wordprocessingInk" xmlns:wne="http://schemas.microsoft.com/office/word/2006/wordml" xmlns:wps="http://schemas.microsoft.com/office/word/2010/wordprocessingShape" mc:Ignorable="w14 w15 w16se w16cid w16 w16cex w16sdtdh w16sdtfl w16du wp14">
   <w:body>
     <w:p>
       <w:pPr>
@@ -748,19 +748,11 @@
         </w:rPr>
         <w:t xml:space="preserve">Length of Beam </w:t>
       </w:r>
-      <w:proofErr w:type="gramStart"/>
-      <w:r>
-        <w:rPr>
-          <w:lang w:val="en-US"/>
-        </w:rPr>
-        <w:t>( Center</w:t>
-      </w:r>
-      <w:proofErr w:type="gramEnd"/>
-      <w:r>
-        <w:rPr>
-          <w:lang w:val="en-US"/>
-        </w:rPr>
-        <w:t xml:space="preserve"> Line Method)</w:t>
+      <w:r>
+        <w:rPr>
+          <w:lang w:val="en-US"/>
+        </w:rPr>
+        <w:t>( Center Line Method)</w:t>
       </w:r>
     </w:p>
     <w:p>
@@ -814,13 +806,7 @@
         <w:rPr>
           <w:lang w:val="en-US"/>
         </w:rPr>
-        <w:t>R</w:t>
-      </w:r>
-      <w:r>
-        <w:rPr>
-          <w:lang w:val="en-US"/>
-        </w:rPr>
-        <w:t>einforcement plan /drawings</w:t>
+        <w:t>Reinforcement plan /drawings</w:t>
       </w:r>
     </w:p>
     <w:p>
@@ -1288,27 +1274,13 @@
         <w:rPr>
           <w:lang w:val="en-US"/>
         </w:rPr>
-        <w:t xml:space="preserve">Number </w:t>
-      </w:r>
-      <w:proofErr w:type="gramStart"/>
-      <w:r>
-        <w:rPr>
-          <w:lang w:val="en-US"/>
-        </w:rPr>
-        <w:t xml:space="preserve">of </w:t>
-      </w:r>
-      <w:r>
-        <w:rPr>
-          <w:lang w:val="en-US"/>
-        </w:rPr>
-        <w:t xml:space="preserve"> parts</w:t>
-      </w:r>
-      <w:proofErr w:type="gramEnd"/>
-      <w:r>
-        <w:rPr>
-          <w:lang w:val="en-US"/>
-        </w:rPr>
-        <w:t xml:space="preserve"> along the length of beam</w:t>
+        <w:t xml:space="preserve">Number of </w:t>
+      </w:r>
+      <w:r>
+        <w:rPr>
+          <w:lang w:val="en-US"/>
+        </w:rPr>
+        <w:t xml:space="preserve"> parts along the length of beam</w:t>
       </w:r>
       <w:r>
         <w:rPr>
@@ -2688,21 +2660,643 @@
         <w:rPr>
           <w:lang w:val="en-US"/>
         </w:rPr>
+        <w:t xml:space="preserve"> has to be considered from the excel sheet directly). </w:t>
+      </w:r>
+      <w:r>
+        <w:rPr>
+          <w:lang w:val="en-US"/>
+        </w:rPr>
+        <w:br/>
+      </w:r>
+    </w:p>
+    <w:p>
+      <w:pPr>
+        <w:rPr>
+          <w:lang w:val="en-US"/>
+        </w:rPr>
+      </w:pPr>
+      <w:r>
+        <w:rPr>
+          <w:lang w:val="en-US"/>
+        </w:rPr>
+        <w:t>Spacer Bars</w:t>
+      </w:r>
+      <w:r>
+        <w:rPr>
+          <w:lang w:val="en-US"/>
+        </w:rPr>
+        <w:t xml:space="preserve"> Rules</w:t>
+      </w:r>
+      <w:r>
+        <w:rPr>
+          <w:lang w:val="en-US"/>
+        </w:rPr>
+        <w:t>:</w:t>
+      </w:r>
+    </w:p>
+    <w:p>
+      <w:pPr>
+        <w:jc w:val="both"/>
+        <w:rPr>
+          <w:lang w:val="en-US"/>
+        </w:rPr>
+      </w:pPr>
+      <w:r>
+        <w:rPr>
+          <w:lang w:val="en-US"/>
+        </w:rPr>
+        <w:t>Space bar to be considered as 25mm dia</w:t>
+      </w:r>
+      <w:r>
+        <w:rPr>
+          <w:lang w:val="en-US"/>
+        </w:rPr>
+        <w:t>meter</w:t>
+      </w:r>
+      <w:r>
+        <w:rPr>
+          <w:lang w:val="en-US"/>
+        </w:rPr>
+        <w:t>(hardcoded)</w:t>
+      </w:r>
+      <w:r>
+        <w:rPr>
+          <w:lang w:val="en-US"/>
+        </w:rPr>
+        <w:t xml:space="preserve"> with spacing of 1m where at least </w:t>
+      </w:r>
+      <w:r>
+        <w:rPr>
+          <w:lang w:val="en-US"/>
+        </w:rPr>
+        <w:t>two</w:t>
+      </w:r>
+      <w:r>
+        <w:rPr>
+          <w:lang w:val="en-US"/>
+        </w:rPr>
+        <w:t xml:space="preserve"> reinforcement bars come together.</w:t>
+      </w:r>
+      <w:r>
+        <w:rPr>
+          <w:lang w:val="en-US"/>
+        </w:rPr>
         <w:t xml:space="preserve"> </w:t>
       </w:r>
-      <w:proofErr w:type="gramStart"/>
-      <w:r>
-        <w:rPr>
-          <w:lang w:val="en-US"/>
-        </w:rPr>
-        <w:t>has to</w:t>
-      </w:r>
-      <w:proofErr w:type="gramEnd"/>
-      <w:r>
-        <w:rPr>
-          <w:lang w:val="en-US"/>
-        </w:rPr>
-        <w:t xml:space="preserve"> be considered from the excel sheet directly). </w:t>
+      <w:r>
+        <w:rPr>
+          <w:lang w:val="en-US"/>
+        </w:rPr>
+        <w:br/>
+      </w:r>
+    </w:p>
+    <w:p>
+      <w:pPr>
+        <w:jc w:val="both"/>
+        <w:rPr>
+          <w:lang w:val="en-US"/>
+        </w:rPr>
+      </w:pPr>
+      <w:r>
+        <w:rPr>
+          <w:lang w:val="en-US"/>
+        </w:rPr>
+        <w:t xml:space="preserve">Eg 1. when there is top bar and top bar extra together. </w:t>
+      </w:r>
+    </w:p>
+    <w:p>
+      <w:pPr>
+        <w:jc w:val="both"/>
+        <w:rPr>
+          <w:lang w:val="en-US"/>
+        </w:rPr>
+      </w:pPr>
+      <w:r>
+        <w:rPr>
+          <w:lang w:val="en-US"/>
+        </w:rPr>
+        <w:t xml:space="preserve">Eg2. </w:t>
+      </w:r>
+      <w:r>
+        <w:rPr>
+          <w:lang w:val="en-US"/>
+        </w:rPr>
+        <w:t xml:space="preserve">when there </w:t>
+      </w:r>
+      <w:r>
+        <w:rPr>
+          <w:lang w:val="en-US"/>
+        </w:rPr>
+        <w:t>are two</w:t>
+      </w:r>
+      <w:r>
+        <w:rPr>
+          <w:lang w:val="en-US"/>
+        </w:rPr>
+        <w:t xml:space="preserve"> top bar</w:t>
+      </w:r>
+      <w:r>
+        <w:rPr>
+          <w:lang w:val="en-US"/>
+        </w:rPr>
+        <w:t>s</w:t>
+      </w:r>
+      <w:r>
+        <w:rPr>
+          <w:lang w:val="en-US"/>
+        </w:rPr>
+        <w:t xml:space="preserve"> together.</w:t>
+      </w:r>
+    </w:p>
+    <w:p>
+      <w:pPr>
+        <w:jc w:val="both"/>
+        <w:rPr>
+          <w:lang w:val="en-US"/>
+        </w:rPr>
+      </w:pPr>
+      <w:r>
+        <w:rPr>
+          <w:lang w:val="en-US"/>
+        </w:rPr>
+        <w:lastRenderedPageBreak/>
+        <w:t xml:space="preserve">Eg </w:t>
+      </w:r>
+      <w:r>
+        <w:rPr>
+          <w:lang w:val="en-US"/>
+        </w:rPr>
+        <w:t>3</w:t>
+      </w:r>
+      <w:r>
+        <w:rPr>
+          <w:lang w:val="en-US"/>
+        </w:rPr>
+        <w:t xml:space="preserve">. when there is </w:t>
+      </w:r>
+      <w:r>
+        <w:rPr>
+          <w:lang w:val="en-US"/>
+        </w:rPr>
+        <w:t>bottom</w:t>
+      </w:r>
+      <w:r>
+        <w:rPr>
+          <w:lang w:val="en-US"/>
+        </w:rPr>
+        <w:t xml:space="preserve"> bar and </w:t>
+      </w:r>
+      <w:r>
+        <w:rPr>
+          <w:lang w:val="en-US"/>
+        </w:rPr>
+        <w:t>bottom</w:t>
+      </w:r>
+      <w:r>
+        <w:rPr>
+          <w:lang w:val="en-US"/>
+        </w:rPr>
+        <w:t xml:space="preserve"> bar extra together.</w:t>
+      </w:r>
+    </w:p>
+    <w:p>
+      <w:pPr>
+        <w:jc w:val="both"/>
+        <w:rPr>
+          <w:lang w:val="en-US"/>
+        </w:rPr>
+      </w:pPr>
+      <w:r>
+        <w:rPr>
+          <w:lang w:val="en-US"/>
+        </w:rPr>
+        <w:t xml:space="preserve">Eg </w:t>
+      </w:r>
+      <w:r>
+        <w:rPr>
+          <w:lang w:val="en-US"/>
+        </w:rPr>
+        <w:t>4</w:t>
+      </w:r>
+      <w:r>
+        <w:rPr>
+          <w:lang w:val="en-US"/>
+        </w:rPr>
+        <w:t xml:space="preserve">. when there </w:t>
+      </w:r>
+      <w:r>
+        <w:rPr>
+          <w:lang w:val="en-US"/>
+        </w:rPr>
+        <w:t>are two</w:t>
+      </w:r>
+      <w:r>
+        <w:rPr>
+          <w:lang w:val="en-US"/>
+        </w:rPr>
+        <w:t xml:space="preserve"> bottom bar</w:t>
+      </w:r>
+      <w:r>
+        <w:rPr>
+          <w:lang w:val="en-US"/>
+        </w:rPr>
+        <w:t>s</w:t>
+      </w:r>
+      <w:r>
+        <w:rPr>
+          <w:lang w:val="en-US"/>
+        </w:rPr>
+        <w:t xml:space="preserve"> together.</w:t>
+      </w:r>
+    </w:p>
+    <w:p>
+      <w:pPr>
+        <w:jc w:val="both"/>
+        <w:rPr>
+          <w:lang w:val="en-US"/>
+        </w:rPr>
+      </w:pPr>
+      <w:r>
+        <w:rPr>
+          <w:lang w:val="en-US"/>
+        </w:rPr>
+        <w:t xml:space="preserve">Where </w:t>
+      </w:r>
+      <w:r>
+        <w:rPr>
+          <w:lang w:val="en-US"/>
+        </w:rPr>
+        <w:t>spacer bar should</w:t>
+      </w:r>
+      <w:r>
+        <w:rPr>
+          <w:lang w:val="en-US"/>
+        </w:rPr>
+        <w:t xml:space="preserve"> not </w:t>
+      </w:r>
+      <w:r>
+        <w:rPr>
+          <w:lang w:val="en-US"/>
+        </w:rPr>
+        <w:t>considered</w:t>
+      </w:r>
+      <w:r>
+        <w:rPr>
+          <w:lang w:val="en-US"/>
+        </w:rPr>
+        <w:t>:</w:t>
+      </w:r>
+    </w:p>
+    <w:p>
+      <w:pPr>
+        <w:jc w:val="both"/>
+        <w:rPr>
+          <w:lang w:val="en-US"/>
+        </w:rPr>
+      </w:pPr>
+      <w:r>
+        <w:rPr>
+          <w:lang w:val="en-US"/>
+        </w:rPr>
+        <w:t xml:space="preserve">Eg 1. when there </w:t>
+      </w:r>
+      <w:r>
+        <w:rPr>
+          <w:lang w:val="en-US"/>
+        </w:rPr>
+        <w:t>are</w:t>
+      </w:r>
+      <w:r>
+        <w:rPr>
+          <w:lang w:val="en-US"/>
+        </w:rPr>
+        <w:t xml:space="preserve"> </w:t>
+      </w:r>
+      <w:r>
+        <w:rPr>
+          <w:lang w:val="en-US"/>
+        </w:rPr>
+        <w:t xml:space="preserve">only </w:t>
+      </w:r>
+      <w:r>
+        <w:rPr>
+          <w:lang w:val="en-US"/>
+        </w:rPr>
+        <w:t xml:space="preserve">top bar </w:t>
+      </w:r>
+      <w:r>
+        <w:rPr>
+          <w:lang w:val="en-US"/>
+        </w:rPr>
+        <w:t>and no</w:t>
+      </w:r>
+      <w:r>
+        <w:rPr>
+          <w:lang w:val="en-US"/>
+        </w:rPr>
+        <w:t xml:space="preserve"> top bar extra together. </w:t>
+      </w:r>
+    </w:p>
+    <w:p>
+      <w:pPr>
+        <w:jc w:val="both"/>
+        <w:rPr>
+          <w:lang w:val="en-US"/>
+        </w:rPr>
+      </w:pPr>
+      <w:r>
+        <w:rPr>
+          <w:lang w:val="en-US"/>
+        </w:rPr>
+        <w:t xml:space="preserve">Eg2. when there </w:t>
+      </w:r>
+      <w:r>
+        <w:rPr>
+          <w:lang w:val="en-US"/>
+        </w:rPr>
+        <w:t>is</w:t>
+      </w:r>
+      <w:r>
+        <w:rPr>
+          <w:lang w:val="en-US"/>
+        </w:rPr>
+        <w:t xml:space="preserve"> </w:t>
+      </w:r>
+      <w:r>
+        <w:rPr>
+          <w:lang w:val="en-US"/>
+        </w:rPr>
+        <w:t>only top bar</w:t>
+      </w:r>
+      <w:r>
+        <w:rPr>
+          <w:lang w:val="en-US"/>
+        </w:rPr>
+        <w:t>.</w:t>
+      </w:r>
+    </w:p>
+    <w:p>
+      <w:pPr>
+        <w:jc w:val="both"/>
+        <w:rPr>
+          <w:lang w:val="en-US"/>
+        </w:rPr>
+      </w:pPr>
+      <w:r>
+        <w:rPr>
+          <w:lang w:val="en-US"/>
+        </w:rPr>
+        <w:t xml:space="preserve">Eg 3. when there </w:t>
+      </w:r>
+      <w:r>
+        <w:rPr>
+          <w:lang w:val="en-US"/>
+        </w:rPr>
+        <w:t>are only</w:t>
+      </w:r>
+      <w:r>
+        <w:rPr>
+          <w:lang w:val="en-US"/>
+        </w:rPr>
+        <w:t xml:space="preserve"> bottom bar and </w:t>
+      </w:r>
+      <w:r>
+        <w:rPr>
+          <w:lang w:val="en-US"/>
+        </w:rPr>
+        <w:t xml:space="preserve">no </w:t>
+      </w:r>
+      <w:r>
+        <w:rPr>
+          <w:lang w:val="en-US"/>
+        </w:rPr>
+        <w:t>bottom bar extra together.</w:t>
+      </w:r>
+    </w:p>
+    <w:p>
+      <w:pPr>
+        <w:jc w:val="both"/>
+        <w:rPr>
+          <w:lang w:val="en-US"/>
+        </w:rPr>
+      </w:pPr>
+      <w:r>
+        <w:rPr>
+          <w:lang w:val="en-US"/>
+        </w:rPr>
+        <w:t>Eg</w:t>
+      </w:r>
+      <w:r>
+        <w:rPr>
+          <w:lang w:val="en-US"/>
+        </w:rPr>
+        <w:t>4</w:t>
+      </w:r>
+      <w:r>
+        <w:rPr>
+          <w:lang w:val="en-US"/>
+        </w:rPr>
+        <w:t xml:space="preserve">. when there is only </w:t>
+      </w:r>
+      <w:r>
+        <w:rPr>
+          <w:lang w:val="en-US"/>
+        </w:rPr>
+        <w:t>bottom</w:t>
+      </w:r>
+      <w:r>
+        <w:rPr>
+          <w:lang w:val="en-US"/>
+        </w:rPr>
+        <w:t xml:space="preserve"> bar.</w:t>
+      </w:r>
+    </w:p>
+    <w:p>
+      <w:pPr>
+        <w:jc w:val="both"/>
+        <w:rPr>
+          <w:lang w:val="en-US"/>
+        </w:rPr>
+      </w:pPr>
+      <w:r>
+        <w:rPr>
+          <w:lang w:val="en-US"/>
+        </w:rPr>
+        <w:t>Note – Spacer bar interpretation to be hardcoded and not be derived from general notes (exceptional case).</w:t>
+      </w:r>
+    </w:p>
+    <w:p>
+      <w:pPr>
+        <w:rPr>
+          <w:lang w:val="en-US"/>
+        </w:rPr>
+      </w:pPr>
+      <w:r>
+        <w:rPr>
+          <w:lang w:val="en-US"/>
+        </w:rPr>
+        <w:t xml:space="preserve">Note2- Estimator validated sheets might have missed spacer bars computations in some beams so need not match for all beams. The above logic should override. </w:t>
+      </w:r>
+      <w:r>
+        <w:rPr>
+          <w:lang w:val="en-US"/>
+        </w:rPr>
+        <w:br/>
+      </w:r>
+      <w:r>
+        <w:rPr>
+          <w:lang w:val="en-US"/>
+        </w:rPr>
+        <w:br/>
+      </w:r>
+      <w:r>
+        <w:rPr>
+          <w:lang w:val="en-US"/>
+        </w:rPr>
+        <w:t>Hardcoded Rules:</w:t>
+      </w:r>
+    </w:p>
+    <w:p>
+      <w:pPr>
+        <w:pStyle w:val="ListParagraph"/>
+        <w:numPr>
+          <w:ilvl w:val="0"/>
+          <w:numId w:val="9"/>
+        </w:numPr>
+        <w:rPr>
+          <w:lang w:val="en-US"/>
+        </w:rPr>
+      </w:pPr>
+      <w:r>
+        <w:rPr>
+          <w:lang w:val="en-US"/>
+        </w:rPr>
+        <w:t>Dia of spacer bars = 25mm</w:t>
+      </w:r>
+    </w:p>
+    <w:p>
+      <w:pPr>
+        <w:pStyle w:val="ListParagraph"/>
+        <w:numPr>
+          <w:ilvl w:val="0"/>
+          <w:numId w:val="9"/>
+        </w:numPr>
+        <w:rPr>
+          <w:lang w:val="en-US"/>
+        </w:rPr>
+      </w:pPr>
+      <w:r>
+        <w:rPr>
+          <w:lang w:val="en-US"/>
+        </w:rPr>
+        <w:t>Spacing of spacer bars = 1000mm (every 1m where two bars come together)</w:t>
+      </w:r>
+    </w:p>
+    <w:p>
+      <w:pPr>
+        <w:pStyle w:val="ListParagraph"/>
+        <w:numPr>
+          <w:ilvl w:val="0"/>
+          <w:numId w:val="9"/>
+        </w:numPr>
+        <w:rPr>
+          <w:lang w:val="en-US"/>
+        </w:rPr>
+      </w:pPr>
+      <w:r>
+        <w:rPr>
+          <w:lang w:val="en-US"/>
+        </w:rPr>
+        <w:t xml:space="preserve">Number of Spacer Bars = (Lenth of overlapping bar / </w:t>
+      </w:r>
+      <w:r>
+        <w:rPr>
+          <w:lang w:val="en-US"/>
+        </w:rPr>
+        <w:t>spacing)</w:t>
+      </w:r>
+      <w:r>
+        <w:rPr>
+          <w:lang w:val="en-US"/>
+        </w:rPr>
+        <w:t xml:space="preserve"> +1</w:t>
+      </w:r>
+    </w:p>
+    <w:p>
+      <w:pPr>
+        <w:pStyle w:val="ListParagraph"/>
+        <w:numPr>
+          <w:ilvl w:val="0"/>
+          <w:numId w:val="9"/>
+        </w:numPr>
+        <w:rPr>
+          <w:lang w:val="en-US"/>
+        </w:rPr>
+      </w:pPr>
+      <w:r>
+        <w:rPr>
+          <w:lang w:val="en-US"/>
+        </w:rPr>
+        <w:t>Cut Length = Width of Beam – 2 * Beam Covers</w:t>
+      </w:r>
+    </w:p>
+    <w:p>
+      <w:pPr>
+        <w:rPr>
+          <w:lang w:val="en-US"/>
+        </w:rPr>
+      </w:pPr>
+      <w:r>
+        <w:rPr>
+          <w:lang w:val="en-US"/>
+        </w:rPr>
+        <w:br/>
+      </w:r>
+    </w:p>
+    <w:p>
+      <w:pPr>
+        <w:jc w:val="both"/>
+        <w:rPr>
+          <w:lang w:val="en-US"/>
+        </w:rPr>
+      </w:pPr>
+    </w:p>
+    <w:p>
+      <w:pPr>
+        <w:jc w:val="both"/>
+        <w:rPr>
+          <w:lang w:val="en-US"/>
+        </w:rPr>
+      </w:pPr>
+    </w:p>
+    <w:p>
+      <w:pPr>
+        <w:jc w:val="both"/>
+        <w:rPr>
+          <w:lang w:val="en-US"/>
+        </w:rPr>
+      </w:pPr>
+    </w:p>
+    <w:p>
+      <w:pPr>
+        <w:jc w:val="both"/>
+        <w:rPr>
+          <w:lang w:val="en-US"/>
+        </w:rPr>
+      </w:pPr>
+    </w:p>
+    <w:p>
+      <w:pPr>
+        <w:jc w:val="both"/>
+        <w:rPr>
+          <w:lang w:val="en-US"/>
+        </w:rPr>
+      </w:pPr>
+      <w:r>
+        <w:rPr>
+          <w:lang w:val="en-US"/>
+        </w:rPr>
+        <w:br/>
       </w:r>
     </w:p>
     <w:sectPr>
@@ -2716,7 +3310,7 @@
 </file>
 
 <file path=word/numbering.xml><?xml version="1.0" encoding="utf-8"?>
-<w:numbering xmlns:wpc="http://schemas.microsoft.com/office/word/2010/wordprocessingCanvas" xmlns:cx="http://schemas.microsoft.com/office/drawing/2014/chartex" xmlns:cx1="http://schemas.microsoft.com/office/drawing/2015/9/8/chartex" xmlns:cx2="http://schemas.microsoft.com/office/drawing/2015/10/21/chartex" xmlns:cx3="http://schemas.microsoft.com/office/drawing/2016/5/9/chartex" xmlns:cx4="http://schemas.microsoft.com/office/drawing/2016/5/10/chartex" xmlns:cx5="http://schemas.microsoft.com/office/drawing/2016/5/11/chartex" xmlns:cx6="http://schemas.microsoft.com/office/drawing/2016/5/12/chartex" xmlns:cx7="http://schemas.microsoft.com/office/drawing/2016/5/13/chartex" xmlns:cx8="http://schemas.microsoft.com/office/drawing/2016/5/14/chartex" xmlns:mc="http://schemas.openxmlformats.org/markup-compatibility/2006" xmlns:aink="http://schemas.microsoft.com/office/drawing/2016/ink" xmlns:am3d="http://schemas.microsoft.com/office/drawing/2017/model3d" xmlns:o="urn:schemas-microsoft-com:office:office" xmlns:oel="http://schemas.microsoft.com/office/2019/extlst" xmlns:r="http://schemas.openxmlformats.org/officeDocument/2006/relationships" xmlns:m="http://schemas.openxmlformats.org/officeDocument/2006/math" xmlns:v="urn:schemas-microsoft-com:vml" xmlns:wp14="http://schemas.microsoft.com/office/word/2010/wordprocessingDrawing" xmlns:wp="http://schemas.openxmlformats.org/drawingml/2006/wordprocessingDrawing" xmlns:w10="urn:schemas-microsoft-com:office:word" xmlns:w="http://schemas.openxmlformats.org/wordprocessingml/2006/main" xmlns:w14="http://schemas.microsoft.com/office/word/2010/wordml" xmlns:w15="http://schemas.microsoft.com/office/word/2012/wordml" xmlns:w16cex="http://schemas.microsoft.com/office/word/2018/wordml/cex" xmlns:w16cid="http://schemas.microsoft.com/office/word/2016/wordml/cid" xmlns:w16="http://schemas.microsoft.com/office/word/2018/wordml" xmlns:w16du="http://schemas.microsoft.com/office/word/2023/wordml/word16du" xmlns:w16sdtdh="http://schemas.microsoft.com/office/word/2020/wordml/sdtdatahash" xmlns:w16sdtfl="http://schemas.microsoft.com/office/word/2024/wordml/sdtformatlock" xmlns:w16se="http://schemas.microsoft.com/office/word/2015/wordml/symex" xmlns:wpg="http://schemas.microsoft.com/office/word/2010/wordprocessingGroup" xmlns:wpi="http://schemas.microsoft.com/office/word/2010/wordprocessingInk" xmlns:wne="http://schemas.microsoft.com/office/word/2006/wordml" xmlns:wps="http://schemas.microsoft.com/office/word/2010/wordprocessingShape" mc:Ignorable="w14 w15 w16se w16cid w16 w16cex w16sdtdh w16sdtfl w16du wp14">
+<w:numbering xmlns:wpc="http://schemas.microsoft.com/office/word/2010/wordprocessingCanvas" xmlns:cx="http://schemas.microsoft.com/office/drawing/2014/chartex" xmlns:cx1="http://schemas.microsoft.com/office/drawing/2015/9/8/chartex" xmlns:cx2="http://schemas.microsoft.com/office/drawing/2015/10/21/chartex" xmlns:cx3="http://schemas.microsoft.com/office/drawing/2016/5/9/chartex" xmlns:cx4="http://schemas.microsoft.com/office/drawing/2016/5/10/chartex" xmlns:cx5="http://schemas.microsoft.com/office/drawing/2016/5/11/chartex" xmlns:cx6="http://schemas.microsoft.com/office/drawing/2016/5/12/chartex" xmlns:cx7="http://schemas.microsoft.com/office/drawing/2016/5/13/chartex" xmlns:cx8="http://schemas.microsoft.com/office/drawing/2016/5/14/chartex" xmlns:mc="http://schemas.openxmlformats.org/markup-compatibility/2006" xmlns:aink="http://schemas.microsoft.com/office/drawing/2016/ink" xmlns:am3d="http://schemas.microsoft.com/office/drawing/2017/model3d" xmlns:o="urn:schemas-microsoft-com:office:office" xmlns:oel="http://schemas.microsoft.com/office/2019/extlst" xmlns:r="http://schemas.openxmlformats.org/officeDocument/2006/relationships" xmlns:m="http://schemas.openxmlformats.org/officeDocument/2006/math" xmlns:v="urn:schemas-microsoft-com:vml" xmlns:wp14="http://schemas.microsoft.com/office/word/2010/wordprocessingDrawing" xmlns:wp="http://schemas.openxmlformats.org/drawingml/2006/wordprocessingDrawing" xmlns:w10="urn:schemas-microsoft-com:office:word" xmlns:w="http://schemas.openxmlformats.org/wordprocessingml/2006/main" xmlns:w14="http://schemas.microsoft.com/office/word/2010/wordml" xmlns:w15="http://schemas.microsoft.com/office/word/2012/wordml" xmlns:w16cei="http://schemas.microsoft.com/office/word/2026/wordml/cei" xmlns:w16cex="http://schemas.microsoft.com/office/word/2018/wordml/cex" xmlns:w16cid="http://schemas.microsoft.com/office/word/2016/wordml/cid" xmlns:w16="http://schemas.microsoft.com/office/word/2018/wordml" xmlns:w16du="http://schemas.microsoft.com/office/word/2023/wordml/word16du" xmlns:w16sdtdh="http://schemas.microsoft.com/office/word/2020/wordml/sdtdatahash" xmlns:w16sdtfl="http://schemas.microsoft.com/office/word/2024/wordml/sdtformatlock" xmlns:w16se="http://schemas.microsoft.com/office/word/2015/wordml/symex" xmlns:wpg="http://schemas.microsoft.com/office/word/2010/wordprocessingGroup" xmlns:wpi="http://schemas.microsoft.com/office/word/2010/wordprocessingInk" xmlns:wne="http://schemas.microsoft.com/office/word/2006/wordml" xmlns:wps="http://schemas.microsoft.com/office/word/2010/wordprocessingShape" mc:Ignorable="w14 w15 w16se w16cid w16 w16cex w16sdtdh w16sdtfl w16du wp14">
   <w:abstractNum w:abstractNumId="0" w15:restartNumberingAfterBreak="0">
     <w:nsid w:val="039E62F8"/>
     <w:multiLevelType w:val="hybridMultilevel"/>
@@ -3057,6 +3651,119 @@
     </w:lvl>
   </w:abstractNum>
   <w:abstractNum w:abstractNumId="3" w15:restartNumberingAfterBreak="0">
+    <w:nsid w:val="36B20E50"/>
+    <w:multiLevelType w:val="hybridMultilevel"/>
+    <w:tmpl w:val="A3FEF86C"/>
+    <w:lvl w:ilvl="0" w:tplc="40090001">
+      <w:start w:val="1"/>
+      <w:numFmt w:val="bullet"/>
+      <w:lvlText w:val=""/>
+      <w:lvlJc w:val="left"/>
+      <w:pPr>
+        <w:ind w:left="720" w:hanging="360"/>
+      </w:pPr>
+      <w:rPr>
+        <w:rFonts w:ascii="Symbol" w:hAnsi="Symbol" w:hint="default"/>
+      </w:rPr>
+    </w:lvl>
+    <w:lvl w:ilvl="1" w:tplc="40090003" w:tentative="1">
+      <w:start w:val="1"/>
+      <w:numFmt w:val="bullet"/>
+      <w:lvlText w:val="o"/>
+      <w:lvlJc w:val="left"/>
+      <w:pPr>
+        <w:ind w:left="1440" w:hanging="360"/>
+      </w:pPr>
+      <w:rPr>
+        <w:rFonts w:ascii="Courier New" w:hAnsi="Courier New" w:cs="Courier New" w:hint="default"/>
+      </w:rPr>
+    </w:lvl>
+    <w:lvl w:ilvl="2" w:tplc="40090005" w:tentative="1">
+      <w:start w:val="1"/>
+      <w:numFmt w:val="bullet"/>
+      <w:lvlText w:val=""/>
+      <w:lvlJc w:val="left"/>
+      <w:pPr>
+        <w:ind w:left="2160" w:hanging="360"/>
+      </w:pPr>
+      <w:rPr>
+        <w:rFonts w:ascii="Wingdings" w:hAnsi="Wingdings" w:hint="default"/>
+      </w:rPr>
+    </w:lvl>
+    <w:lvl w:ilvl="3" w:tplc="40090001" w:tentative="1">
+      <w:start w:val="1"/>
+      <w:numFmt w:val="bullet"/>
+      <w:lvlText w:val=""/>
+      <w:lvlJc w:val="left"/>
+      <w:pPr>
+        <w:ind w:left="2880" w:hanging="360"/>
+      </w:pPr>
+      <w:rPr>
+        <w:rFonts w:ascii="Symbol" w:hAnsi="Symbol" w:hint="default"/>
+      </w:rPr>
+    </w:lvl>
+    <w:lvl w:ilvl="4" w:tplc="40090003" w:tentative="1">
+      <w:start w:val="1"/>
+      <w:numFmt w:val="bullet"/>
+      <w:lvlText w:val="o"/>
+      <w:lvlJc w:val="left"/>
+      <w:pPr>
+        <w:ind w:left="3600" w:hanging="360"/>
+      </w:pPr>
+      <w:rPr>
+        <w:rFonts w:ascii="Courier New" w:hAnsi="Courier New" w:cs="Courier New" w:hint="default"/>
+      </w:rPr>
+    </w:lvl>
+    <w:lvl w:ilvl="5" w:tplc="40090005" w:tentative="1">
+      <w:start w:val="1"/>
+      <w:numFmt w:val="bullet"/>
+      <w:lvlText w:val=""/>
+      <w:lvlJc w:val="left"/>
+      <w:pPr>
+        <w:ind w:left="4320" w:hanging="360"/>
+      </w:pPr>
+      <w:rPr>
+        <w:rFonts w:ascii="Wingdings" w:hAnsi="Wingdings" w:hint="default"/>
+      </w:rPr>
+    </w:lvl>
+    <w:lvl w:ilvl="6" w:tplc="40090001" w:tentative="1">
+      <w:start w:val="1"/>
+      <w:numFmt w:val="bullet"/>
+      <w:lvlText w:val=""/>
+      <w:lvlJc w:val="left"/>
+      <w:pPr>
+        <w:ind w:left="5040" w:hanging="360"/>
+      </w:pPr>
+      <w:rPr>
+        <w:rFonts w:ascii="Symbol" w:hAnsi="Symbol" w:hint="default"/>
+      </w:rPr>
+    </w:lvl>
+    <w:lvl w:ilvl="7" w:tplc="40090003" w:tentative="1">
+      <w:start w:val="1"/>
+      <w:numFmt w:val="bullet"/>
+      <w:lvlText w:val="o"/>
+      <w:lvlJc w:val="left"/>
+      <w:pPr>
+        <w:ind w:left="5760" w:hanging="360"/>
+      </w:pPr>
+      <w:rPr>
+        <w:rFonts w:ascii="Courier New" w:hAnsi="Courier New" w:cs="Courier New" w:hint="default"/>
+      </w:rPr>
+    </w:lvl>
+    <w:lvl w:ilvl="8" w:tplc="40090005" w:tentative="1">
+      <w:start w:val="1"/>
+      <w:numFmt w:val="bullet"/>
+      <w:lvlText w:val=""/>
+      <w:lvlJc w:val="left"/>
+      <w:pPr>
+        <w:ind w:left="6480" w:hanging="360"/>
+      </w:pPr>
+      <w:rPr>
+        <w:rFonts w:ascii="Wingdings" w:hAnsi="Wingdings" w:hint="default"/>
+      </w:rPr>
+    </w:lvl>
+  </w:abstractNum>
+  <w:abstractNum w:abstractNumId="4" w15:restartNumberingAfterBreak="0">
     <w:nsid w:val="375E5591"/>
     <w:multiLevelType w:val="hybridMultilevel"/>
     <w:tmpl w:val="A5DC5E44"/>
@@ -3145,7 +3852,7 @@
       </w:pPr>
     </w:lvl>
   </w:abstractNum>
-  <w:abstractNum w:abstractNumId="4" w15:restartNumberingAfterBreak="0">
+  <w:abstractNum w:abstractNumId="5" w15:restartNumberingAfterBreak="0">
     <w:nsid w:val="41FF258D"/>
     <w:multiLevelType w:val="hybridMultilevel"/>
     <w:tmpl w:val="BD12118C"/>
@@ -3258,7 +3965,7 @@
       </w:rPr>
     </w:lvl>
   </w:abstractNum>
-  <w:abstractNum w:abstractNumId="5" w15:restartNumberingAfterBreak="0">
+  <w:abstractNum w:abstractNumId="6" w15:restartNumberingAfterBreak="0">
     <w:nsid w:val="592F1E8B"/>
     <w:multiLevelType w:val="hybridMultilevel"/>
     <w:tmpl w:val="19B813DC"/>
@@ -3347,7 +4054,120 @@
       </w:pPr>
     </w:lvl>
   </w:abstractNum>
-  <w:abstractNum w:abstractNumId="6" w15:restartNumberingAfterBreak="0">
+  <w:abstractNum w:abstractNumId="7" w15:restartNumberingAfterBreak="0">
+    <w:nsid w:val="6D104E75"/>
+    <w:multiLevelType w:val="hybridMultilevel"/>
+    <w:tmpl w:val="5DC49128"/>
+    <w:lvl w:ilvl="0" w:tplc="40090001">
+      <w:start w:val="1"/>
+      <w:numFmt w:val="bullet"/>
+      <w:lvlText w:val=""/>
+      <w:lvlJc w:val="left"/>
+      <w:pPr>
+        <w:ind w:left="720" w:hanging="360"/>
+      </w:pPr>
+      <w:rPr>
+        <w:rFonts w:ascii="Symbol" w:hAnsi="Symbol" w:hint="default"/>
+      </w:rPr>
+    </w:lvl>
+    <w:lvl w:ilvl="1" w:tplc="40090003" w:tentative="1">
+      <w:start w:val="1"/>
+      <w:numFmt w:val="bullet"/>
+      <w:lvlText w:val="o"/>
+      <w:lvlJc w:val="left"/>
+      <w:pPr>
+        <w:ind w:left="1440" w:hanging="360"/>
+      </w:pPr>
+      <w:rPr>
+        <w:rFonts w:ascii="Courier New" w:hAnsi="Courier New" w:cs="Courier New" w:hint="default"/>
+      </w:rPr>
+    </w:lvl>
+    <w:lvl w:ilvl="2" w:tplc="40090005" w:tentative="1">
+      <w:start w:val="1"/>
+      <w:numFmt w:val="bullet"/>
+      <w:lvlText w:val=""/>
+      <w:lvlJc w:val="left"/>
+      <w:pPr>
+        <w:ind w:left="2160" w:hanging="360"/>
+      </w:pPr>
+      <w:rPr>
+        <w:rFonts w:ascii="Wingdings" w:hAnsi="Wingdings" w:hint="default"/>
+      </w:rPr>
+    </w:lvl>
+    <w:lvl w:ilvl="3" w:tplc="40090001" w:tentative="1">
+      <w:start w:val="1"/>
+      <w:numFmt w:val="bullet"/>
+      <w:lvlText w:val=""/>
+      <w:lvlJc w:val="left"/>
+      <w:pPr>
+        <w:ind w:left="2880" w:hanging="360"/>
+      </w:pPr>
+      <w:rPr>
+        <w:rFonts w:ascii="Symbol" w:hAnsi="Symbol" w:hint="default"/>
+      </w:rPr>
+    </w:lvl>
+    <w:lvl w:ilvl="4" w:tplc="40090003" w:tentative="1">
+      <w:start w:val="1"/>
+      <w:numFmt w:val="bullet"/>
+      <w:lvlText w:val="o"/>
+      <w:lvlJc w:val="left"/>
+      <w:pPr>
+        <w:ind w:left="3600" w:hanging="360"/>
+      </w:pPr>
+      <w:rPr>
+        <w:rFonts w:ascii="Courier New" w:hAnsi="Courier New" w:cs="Courier New" w:hint="default"/>
+      </w:rPr>
+    </w:lvl>
+    <w:lvl w:ilvl="5" w:tplc="40090005" w:tentative="1">
+      <w:start w:val="1"/>
+      <w:numFmt w:val="bullet"/>
+      <w:lvlText w:val=""/>
+      <w:lvlJc w:val="left"/>
+      <w:pPr>
+        <w:ind w:left="4320" w:hanging="360"/>
+      </w:pPr>
+      <w:rPr>
+        <w:rFonts w:ascii="Wingdings" w:hAnsi="Wingdings" w:hint="default"/>
+      </w:rPr>
+    </w:lvl>
+    <w:lvl w:ilvl="6" w:tplc="40090001" w:tentative="1">
+      <w:start w:val="1"/>
+      <w:numFmt w:val="bullet"/>
+      <w:lvlText w:val=""/>
+      <w:lvlJc w:val="left"/>
+      <w:pPr>
+        <w:ind w:left="5040" w:hanging="360"/>
+      </w:pPr>
+      <w:rPr>
+        <w:rFonts w:ascii="Symbol" w:hAnsi="Symbol" w:hint="default"/>
+      </w:rPr>
+    </w:lvl>
+    <w:lvl w:ilvl="7" w:tplc="40090003" w:tentative="1">
+      <w:start w:val="1"/>
+      <w:numFmt w:val="bullet"/>
+      <w:lvlText w:val="o"/>
+      <w:lvlJc w:val="left"/>
+      <w:pPr>
+        <w:ind w:left="5760" w:hanging="360"/>
+      </w:pPr>
+      <w:rPr>
+        <w:rFonts w:ascii="Courier New" w:hAnsi="Courier New" w:cs="Courier New" w:hint="default"/>
+      </w:rPr>
+    </w:lvl>
+    <w:lvl w:ilvl="8" w:tplc="40090005" w:tentative="1">
+      <w:start w:val="1"/>
+      <w:numFmt w:val="bullet"/>
+      <w:lvlText w:val=""/>
+      <w:lvlJc w:val="left"/>
+      <w:pPr>
+        <w:ind w:left="6480" w:hanging="360"/>
+      </w:pPr>
+      <w:rPr>
+        <w:rFonts w:ascii="Wingdings" w:hAnsi="Wingdings" w:hint="default"/>
+      </w:rPr>
+    </w:lvl>
+  </w:abstractNum>
+  <w:abstractNum w:abstractNumId="8" w15:restartNumberingAfterBreak="0">
     <w:nsid w:val="70106393"/>
     <w:multiLevelType w:val="hybridMultilevel"/>
     <w:tmpl w:val="F6D4AFE4"/>
@@ -3440,10 +4260,10 @@
     </w:lvl>
   </w:abstractNum>
   <w:num w:numId="1" w16cid:durableId="651838237">
-    <w:abstractNumId w:val="6"/>
+    <w:abstractNumId w:val="8"/>
   </w:num>
   <w:num w:numId="2" w16cid:durableId="1295216228">
-    <w:abstractNumId w:val="3"/>
+    <w:abstractNumId w:val="4"/>
   </w:num>
   <w:num w:numId="3" w16cid:durableId="1522087492">
     <w:abstractNumId w:val="0"/>
@@ -3452,13 +4272,19 @@
     <w:abstractNumId w:val="2"/>
   </w:num>
   <w:num w:numId="5" w16cid:durableId="803625113">
-    <w:abstractNumId w:val="5"/>
+    <w:abstractNumId w:val="6"/>
   </w:num>
   <w:num w:numId="6" w16cid:durableId="312375587">
     <w:abstractNumId w:val="1"/>
   </w:num>
   <w:num w:numId="7" w16cid:durableId="1419983893">
-    <w:abstractNumId w:val="4"/>
+    <w:abstractNumId w:val="5"/>
+  </w:num>
+  <w:num w:numId="8" w16cid:durableId="1941911102">
+    <w:abstractNumId w:val="3"/>
+  </w:num>
+  <w:num w:numId="9" w16cid:durableId="1696954472">
+    <w:abstractNumId w:val="7"/>
   </w:num>
 </w:numbering>
 </file>

</xml_diff>

<commit_message>
docs: reorganize repo docs and add Hybrid vision crop map
Move historical prompts and Version8 audit reports into Required Docs and V10_Organize, and add the production Vision crop contract, architecture code map, and hybrid evidence viewer.

Co-authored-by: Cursor <cursoragent@cursor.com>
</commit_message>
<xml_diff>
--- a/Version1/docs/Estimator_ReadingDrawings&Calculations.docx
+++ b/Version1/docs/Estimator_ReadingDrawings&Calculations.docx
@@ -1,6 +1,6 @@
 
 <file path=word/document.xml><?xml version="1.0" encoding="utf-8"?>
-<w:document xmlns:wpc="http://schemas.microsoft.com/office/word/2010/wordprocessingCanvas" xmlns:cx="http://schemas.microsoft.com/office/drawing/2014/chartex" xmlns:cx1="http://schemas.microsoft.com/office/drawing/2015/9/8/chartex" xmlns:cx2="http://schemas.microsoft.com/office/drawing/2015/10/21/chartex" xmlns:cx3="http://schemas.microsoft.com/office/drawing/2016/5/9/chartex" xmlns:cx4="http://schemas.microsoft.com/office/drawing/2016/5/10/chartex" xmlns:cx5="http://schemas.microsoft.com/office/drawing/2016/5/11/chartex" xmlns:cx6="http://schemas.microsoft.com/office/drawing/2016/5/12/chartex" xmlns:cx7="http://schemas.microsoft.com/office/drawing/2016/5/13/chartex" xmlns:cx8="http://schemas.microsoft.com/office/drawing/2016/5/14/chartex" xmlns:mc="http://schemas.openxmlformats.org/markup-compatibility/2006" xmlns:aink="http://schemas.microsoft.com/office/drawing/2016/ink" xmlns:am3d="http://schemas.microsoft.com/office/drawing/2017/model3d" xmlns:o="urn:schemas-microsoft-com:office:office" xmlns:oel="http://schemas.microsoft.com/office/2019/extlst" xmlns:r="http://schemas.openxmlformats.org/officeDocument/2006/relationships" xmlns:m="http://schemas.openxmlformats.org/officeDocument/2006/math" xmlns:v="urn:schemas-microsoft-com:vml" xmlns:wp14="http://schemas.microsoft.com/office/word/2010/wordprocessingDrawing" xmlns:wp="http://schemas.openxmlformats.org/drawingml/2006/wordprocessingDrawing" xmlns:w10="urn:schemas-microsoft-com:office:word" xmlns:w="http://schemas.openxmlformats.org/wordprocessingml/2006/main" xmlns:w14="http://schemas.microsoft.com/office/word/2010/wordml" xmlns:w15="http://schemas.microsoft.com/office/word/2012/wordml" xmlns:w16cei="http://schemas.microsoft.com/office/word/2026/wordml/cei" xmlns:w16cex="http://schemas.microsoft.com/office/word/2018/wordml/cex" xmlns:w16cid="http://schemas.microsoft.com/office/word/2016/wordml/cid" xmlns:w16="http://schemas.microsoft.com/office/word/2018/wordml" xmlns:w16du="http://schemas.microsoft.com/office/word/2023/wordml/word16du" xmlns:w16sdtdh="http://schemas.microsoft.com/office/word/2020/wordml/sdtdatahash" xmlns:w16sdtfl="http://schemas.microsoft.com/office/word/2024/wordml/sdtformatlock" xmlns:w16se="http://schemas.microsoft.com/office/word/2015/wordml/symex" xmlns:wpg="http://schemas.microsoft.com/office/word/2010/wordprocessingGroup" xmlns:wpi="http://schemas.microsoft.com/office/word/2010/wordprocessingInk" xmlns:wne="http://schemas.microsoft.com/office/word/2006/wordml" xmlns:wps="http://schemas.microsoft.com/office/word/2010/wordprocessingShape" mc:Ignorable="w14 w15 w16se w16cid w16 w16cex w16sdtdh w16sdtfl w16du wp14">
+<w:document xmlns:wpc="http://schemas.microsoft.com/office/word/2010/wordprocessingCanvas" xmlns:cx="http://schemas.microsoft.com/office/drawing/2014/chartex" xmlns:cx1="http://schemas.microsoft.com/office/drawing/2015/9/8/chartex" xmlns:cx2="http://schemas.microsoft.com/office/drawing/2015/10/21/chartex" xmlns:cx3="http://schemas.microsoft.com/office/drawing/2016/5/9/chartex" xmlns:cx4="http://schemas.microsoft.com/office/drawing/2016/5/10/chartex" xmlns:cx5="http://schemas.microsoft.com/office/drawing/2016/5/11/chartex" xmlns:cx6="http://schemas.microsoft.com/office/drawing/2016/5/12/chartex" xmlns:cx7="http://schemas.microsoft.com/office/drawing/2016/5/13/chartex" xmlns:cx8="http://schemas.microsoft.com/office/drawing/2016/5/14/chartex" xmlns:mc="http://schemas.openxmlformats.org/markup-compatibility/2006" xmlns:aink="http://schemas.microsoft.com/office/drawing/2016/ink" xmlns:am3d="http://schemas.microsoft.com/office/drawing/2017/model3d" xmlns:o="urn:schemas-microsoft-com:office:office" xmlns:oel="http://schemas.microsoft.com/office/2019/extlst" xmlns:r="http://schemas.openxmlformats.org/officeDocument/2006/relationships" xmlns:m="http://schemas.openxmlformats.org/officeDocument/2006/math" xmlns:v="urn:schemas-microsoft-com:vml" xmlns:wp14="http://schemas.microsoft.com/office/word/2010/wordprocessingDrawing" xmlns:wp="http://schemas.openxmlformats.org/drawingml/2006/wordprocessingDrawing" xmlns:w10="urn:schemas-microsoft-com:office:word" xmlns:w="http://schemas.openxmlformats.org/wordprocessingml/2006/main" xmlns:w14="http://schemas.microsoft.com/office/word/2010/wordml" xmlns:w15="http://schemas.microsoft.com/office/word/2012/wordml" xmlns:w16cex="http://schemas.microsoft.com/office/word/2018/wordml/cex" xmlns:w16cid="http://schemas.microsoft.com/office/word/2016/wordml/cid" xmlns:w16="http://schemas.microsoft.com/office/word/2018/wordml" xmlns:w16du="http://schemas.microsoft.com/office/word/2023/wordml/word16du" xmlns:w16sdtdh="http://schemas.microsoft.com/office/word/2020/wordml/sdtdatahash" xmlns:w16sdtfl="http://schemas.microsoft.com/office/word/2024/wordml/sdtformatlock" xmlns:w16se="http://schemas.microsoft.com/office/word/2015/wordml/symex" xmlns:wpg="http://schemas.microsoft.com/office/word/2010/wordprocessingGroup" xmlns:wpi="http://schemas.microsoft.com/office/word/2010/wordprocessingInk" xmlns:wne="http://schemas.microsoft.com/office/word/2006/wordml" xmlns:wps="http://schemas.microsoft.com/office/word/2010/wordprocessingShape" mc:Ignorable="w14 w15 w16se w16cid w16 w16cex w16sdtdh w16sdtfl w16du wp14">
   <w:body>
     <w:p>
       <w:pPr>
@@ -2554,6 +2554,12 @@
         </w:rPr>
         <w:t>Sheet Name - SE-GN-100-SH-02</w:t>
       </w:r>
+      <w:r>
+        <w:rPr>
+          <w:lang w:val="en-US"/>
+        </w:rPr>
+        <w:t xml:space="preserve">. Diameter specific. </w:t>
+      </w:r>
     </w:p>
     <w:p>
       <w:pPr>
@@ -2775,37 +2781,7 @@
         <w:rPr>
           <w:lang w:val="en-US"/>
         </w:rPr>
-        <w:t xml:space="preserve">Eg2. </w:t>
-      </w:r>
-      <w:r>
-        <w:rPr>
-          <w:lang w:val="en-US"/>
-        </w:rPr>
-        <w:t xml:space="preserve">when there </w:t>
-      </w:r>
-      <w:r>
-        <w:rPr>
-          <w:lang w:val="en-US"/>
-        </w:rPr>
-        <w:t>are two</w:t>
-      </w:r>
-      <w:r>
-        <w:rPr>
-          <w:lang w:val="en-US"/>
-        </w:rPr>
-        <w:t xml:space="preserve"> top bar</w:t>
-      </w:r>
-      <w:r>
-        <w:rPr>
-          <w:lang w:val="en-US"/>
-        </w:rPr>
-        <w:t>s</w:t>
-      </w:r>
-      <w:r>
-        <w:rPr>
-          <w:lang w:val="en-US"/>
-        </w:rPr>
-        <w:t xml:space="preserve"> together.</w:t>
+        <w:t>Eg2. when there are two top bars together.</w:t>
       </w:r>
     </w:p>
     <w:p>
@@ -2820,43 +2796,7 @@
           <w:lang w:val="en-US"/>
         </w:rPr>
         <w:lastRenderedPageBreak/>
-        <w:t xml:space="preserve">Eg </w:t>
-      </w:r>
-      <w:r>
-        <w:rPr>
-          <w:lang w:val="en-US"/>
-        </w:rPr>
-        <w:t>3</w:t>
-      </w:r>
-      <w:r>
-        <w:rPr>
-          <w:lang w:val="en-US"/>
-        </w:rPr>
-        <w:t xml:space="preserve">. when there is </w:t>
-      </w:r>
-      <w:r>
-        <w:rPr>
-          <w:lang w:val="en-US"/>
-        </w:rPr>
-        <w:t>bottom</w:t>
-      </w:r>
-      <w:r>
-        <w:rPr>
-          <w:lang w:val="en-US"/>
-        </w:rPr>
-        <w:t xml:space="preserve"> bar and </w:t>
-      </w:r>
-      <w:r>
-        <w:rPr>
-          <w:lang w:val="en-US"/>
-        </w:rPr>
-        <w:t>bottom</w:t>
-      </w:r>
-      <w:r>
-        <w:rPr>
-          <w:lang w:val="en-US"/>
-        </w:rPr>
-        <w:t xml:space="preserve"> bar extra together.</w:t>
+        <w:t>Eg 3. when there is bottom bar and bottom bar extra together.</w:t>
       </w:r>
     </w:p>
     <w:p>
@@ -2870,43 +2810,7 @@
         <w:rPr>
           <w:lang w:val="en-US"/>
         </w:rPr>
-        <w:t xml:space="preserve">Eg </w:t>
-      </w:r>
-      <w:r>
-        <w:rPr>
-          <w:lang w:val="en-US"/>
-        </w:rPr>
-        <w:t>4</w:t>
-      </w:r>
-      <w:r>
-        <w:rPr>
-          <w:lang w:val="en-US"/>
-        </w:rPr>
-        <w:t xml:space="preserve">. when there </w:t>
-      </w:r>
-      <w:r>
-        <w:rPr>
-          <w:lang w:val="en-US"/>
-        </w:rPr>
-        <w:t>are two</w:t>
-      </w:r>
-      <w:r>
-        <w:rPr>
-          <w:lang w:val="en-US"/>
-        </w:rPr>
-        <w:t xml:space="preserve"> bottom bar</w:t>
-      </w:r>
-      <w:r>
-        <w:rPr>
-          <w:lang w:val="en-US"/>
-        </w:rPr>
-        <w:t>s</w:t>
-      </w:r>
-      <w:r>
-        <w:rPr>
-          <w:lang w:val="en-US"/>
-        </w:rPr>
-        <w:t xml:space="preserve"> together.</w:t>
+        <w:t>Eg 4. when there are two bottom bars together.</w:t>
       </w:r>
     </w:p>
     <w:p>
@@ -2958,43 +2862,7 @@
         <w:rPr>
           <w:lang w:val="en-US"/>
         </w:rPr>
-        <w:t xml:space="preserve">Eg 1. when there </w:t>
-      </w:r>
-      <w:r>
-        <w:rPr>
-          <w:lang w:val="en-US"/>
-        </w:rPr>
-        <w:t>are</w:t>
-      </w:r>
-      <w:r>
-        <w:rPr>
-          <w:lang w:val="en-US"/>
-        </w:rPr>
-        <w:t xml:space="preserve"> </w:t>
-      </w:r>
-      <w:r>
-        <w:rPr>
-          <w:lang w:val="en-US"/>
-        </w:rPr>
-        <w:t xml:space="preserve">only </w:t>
-      </w:r>
-      <w:r>
-        <w:rPr>
-          <w:lang w:val="en-US"/>
-        </w:rPr>
-        <w:t xml:space="preserve">top bar </w:t>
-      </w:r>
-      <w:r>
-        <w:rPr>
-          <w:lang w:val="en-US"/>
-        </w:rPr>
-        <w:t>and no</w:t>
-      </w:r>
-      <w:r>
-        <w:rPr>
-          <w:lang w:val="en-US"/>
-        </w:rPr>
-        <w:t xml:space="preserve"> top bar extra together. </w:t>
+        <w:t xml:space="preserve">Eg 1. when there are only top bar and no top bar extra together. </w:t>
       </w:r>
     </w:p>
     <w:p>
@@ -3008,31 +2876,7 @@
         <w:rPr>
           <w:lang w:val="en-US"/>
         </w:rPr>
-        <w:t xml:space="preserve">Eg2. when there </w:t>
-      </w:r>
-      <w:r>
-        <w:rPr>
-          <w:lang w:val="en-US"/>
-        </w:rPr>
-        <w:t>is</w:t>
-      </w:r>
-      <w:r>
-        <w:rPr>
-          <w:lang w:val="en-US"/>
-        </w:rPr>
-        <w:t xml:space="preserve"> </w:t>
-      </w:r>
-      <w:r>
-        <w:rPr>
-          <w:lang w:val="en-US"/>
-        </w:rPr>
-        <w:t>only top bar</w:t>
-      </w:r>
-      <w:r>
-        <w:rPr>
-          <w:lang w:val="en-US"/>
-        </w:rPr>
-        <w:t>.</w:t>
+        <w:t>Eg2. when there is only top bar.</w:t>
       </w:r>
     </w:p>
     <w:p>
@@ -3046,31 +2890,7 @@
         <w:rPr>
           <w:lang w:val="en-US"/>
         </w:rPr>
-        <w:t xml:space="preserve">Eg 3. when there </w:t>
-      </w:r>
-      <w:r>
-        <w:rPr>
-          <w:lang w:val="en-US"/>
-        </w:rPr>
-        <w:t>are only</w:t>
-      </w:r>
-      <w:r>
-        <w:rPr>
-          <w:lang w:val="en-US"/>
-        </w:rPr>
-        <w:t xml:space="preserve"> bottom bar and </w:t>
-      </w:r>
-      <w:r>
-        <w:rPr>
-          <w:lang w:val="en-US"/>
-        </w:rPr>
-        <w:t xml:space="preserve">no </w:t>
-      </w:r>
-      <w:r>
-        <w:rPr>
-          <w:lang w:val="en-US"/>
-        </w:rPr>
-        <w:t>bottom bar extra together.</w:t>
+        <w:t>Eg 3. when there are only bottom bar and no bottom bar extra together.</w:t>
       </w:r>
     </w:p>
     <w:p>
@@ -3084,31 +2904,7 @@
         <w:rPr>
           <w:lang w:val="en-US"/>
         </w:rPr>
-        <w:t>Eg</w:t>
-      </w:r>
-      <w:r>
-        <w:rPr>
-          <w:lang w:val="en-US"/>
-        </w:rPr>
-        <w:t>4</w:t>
-      </w:r>
-      <w:r>
-        <w:rPr>
-          <w:lang w:val="en-US"/>
-        </w:rPr>
-        <w:t xml:space="preserve">. when there is only </w:t>
-      </w:r>
-      <w:r>
-        <w:rPr>
-          <w:lang w:val="en-US"/>
-        </w:rPr>
-        <w:t>bottom</w:t>
-      </w:r>
-      <w:r>
-        <w:rPr>
-          <w:lang w:val="en-US"/>
-        </w:rPr>
-        <w:t xml:space="preserve"> bar.</w:t>
+        <w:t>Eg4. when there is only bottom bar.</w:t>
       </w:r>
     </w:p>
     <w:p>
@@ -3310,7 +3106,7 @@
 </file>
 
 <file path=word/numbering.xml><?xml version="1.0" encoding="utf-8"?>
-<w:numbering xmlns:wpc="http://schemas.microsoft.com/office/word/2010/wordprocessingCanvas" xmlns:cx="http://schemas.microsoft.com/office/drawing/2014/chartex" xmlns:cx1="http://schemas.microsoft.com/office/drawing/2015/9/8/chartex" xmlns:cx2="http://schemas.microsoft.com/office/drawing/2015/10/21/chartex" xmlns:cx3="http://schemas.microsoft.com/office/drawing/2016/5/9/chartex" xmlns:cx4="http://schemas.microsoft.com/office/drawing/2016/5/10/chartex" xmlns:cx5="http://schemas.microsoft.com/office/drawing/2016/5/11/chartex" xmlns:cx6="http://schemas.microsoft.com/office/drawing/2016/5/12/chartex" xmlns:cx7="http://schemas.microsoft.com/office/drawing/2016/5/13/chartex" xmlns:cx8="http://schemas.microsoft.com/office/drawing/2016/5/14/chartex" xmlns:mc="http://schemas.openxmlformats.org/markup-compatibility/2006" xmlns:aink="http://schemas.microsoft.com/office/drawing/2016/ink" xmlns:am3d="http://schemas.microsoft.com/office/drawing/2017/model3d" xmlns:o="urn:schemas-microsoft-com:office:office" xmlns:oel="http://schemas.microsoft.com/office/2019/extlst" xmlns:r="http://schemas.openxmlformats.org/officeDocument/2006/relationships" xmlns:m="http://schemas.openxmlformats.org/officeDocument/2006/math" xmlns:v="urn:schemas-microsoft-com:vml" xmlns:wp14="http://schemas.microsoft.com/office/word/2010/wordprocessingDrawing" xmlns:wp="http://schemas.openxmlformats.org/drawingml/2006/wordprocessingDrawing" xmlns:w10="urn:schemas-microsoft-com:office:word" xmlns:w="http://schemas.openxmlformats.org/wordprocessingml/2006/main" xmlns:w14="http://schemas.microsoft.com/office/word/2010/wordml" xmlns:w15="http://schemas.microsoft.com/office/word/2012/wordml" xmlns:w16cei="http://schemas.microsoft.com/office/word/2026/wordml/cei" xmlns:w16cex="http://schemas.microsoft.com/office/word/2018/wordml/cex" xmlns:w16cid="http://schemas.microsoft.com/office/word/2016/wordml/cid" xmlns:w16="http://schemas.microsoft.com/office/word/2018/wordml" xmlns:w16du="http://schemas.microsoft.com/office/word/2023/wordml/word16du" xmlns:w16sdtdh="http://schemas.microsoft.com/office/word/2020/wordml/sdtdatahash" xmlns:w16sdtfl="http://schemas.microsoft.com/office/word/2024/wordml/sdtformatlock" xmlns:w16se="http://schemas.microsoft.com/office/word/2015/wordml/symex" xmlns:wpg="http://schemas.microsoft.com/office/word/2010/wordprocessingGroup" xmlns:wpi="http://schemas.microsoft.com/office/word/2010/wordprocessingInk" xmlns:wne="http://schemas.microsoft.com/office/word/2006/wordml" xmlns:wps="http://schemas.microsoft.com/office/word/2010/wordprocessingShape" mc:Ignorable="w14 w15 w16se w16cid w16 w16cex w16sdtdh w16sdtfl w16du wp14">
+<w:numbering xmlns:wpc="http://schemas.microsoft.com/office/word/2010/wordprocessingCanvas" xmlns:cx="http://schemas.microsoft.com/office/drawing/2014/chartex" xmlns:cx1="http://schemas.microsoft.com/office/drawing/2015/9/8/chartex" xmlns:cx2="http://schemas.microsoft.com/office/drawing/2015/10/21/chartex" xmlns:cx3="http://schemas.microsoft.com/office/drawing/2016/5/9/chartex" xmlns:cx4="http://schemas.microsoft.com/office/drawing/2016/5/10/chartex" xmlns:cx5="http://schemas.microsoft.com/office/drawing/2016/5/11/chartex" xmlns:cx6="http://schemas.microsoft.com/office/drawing/2016/5/12/chartex" xmlns:cx7="http://schemas.microsoft.com/office/drawing/2016/5/13/chartex" xmlns:cx8="http://schemas.microsoft.com/office/drawing/2016/5/14/chartex" xmlns:mc="http://schemas.openxmlformats.org/markup-compatibility/2006" xmlns:aink="http://schemas.microsoft.com/office/drawing/2016/ink" xmlns:am3d="http://schemas.microsoft.com/office/drawing/2017/model3d" xmlns:o="urn:schemas-microsoft-com:office:office" xmlns:oel="http://schemas.microsoft.com/office/2019/extlst" xmlns:r="http://schemas.openxmlformats.org/officeDocument/2006/relationships" xmlns:m="http://schemas.openxmlformats.org/officeDocument/2006/math" xmlns:v="urn:schemas-microsoft-com:vml" xmlns:wp14="http://schemas.microsoft.com/office/word/2010/wordprocessingDrawing" xmlns:wp="http://schemas.openxmlformats.org/drawingml/2006/wordprocessingDrawing" xmlns:w10="urn:schemas-microsoft-com:office:word" xmlns:w="http://schemas.openxmlformats.org/wordprocessingml/2006/main" xmlns:w14="http://schemas.microsoft.com/office/word/2010/wordml" xmlns:w15="http://schemas.microsoft.com/office/word/2012/wordml" xmlns:w16cex="http://schemas.microsoft.com/office/word/2018/wordml/cex" xmlns:w16cid="http://schemas.microsoft.com/office/word/2016/wordml/cid" xmlns:w16="http://schemas.microsoft.com/office/word/2018/wordml" xmlns:w16du="http://schemas.microsoft.com/office/word/2023/wordml/word16du" xmlns:w16sdtdh="http://schemas.microsoft.com/office/word/2020/wordml/sdtdatahash" xmlns:w16sdtfl="http://schemas.microsoft.com/office/word/2024/wordml/sdtformatlock" xmlns:w16se="http://schemas.microsoft.com/office/word/2015/wordml/symex" xmlns:wpg="http://schemas.microsoft.com/office/word/2010/wordprocessingGroup" xmlns:wpi="http://schemas.microsoft.com/office/word/2010/wordprocessingInk" xmlns:wne="http://schemas.microsoft.com/office/word/2006/wordml" xmlns:wps="http://schemas.microsoft.com/office/word/2010/wordprocessingShape" mc:Ignorable="w14 w15 w16se w16cid w16 w16cex w16sdtdh w16sdtfl w16du wp14">
   <w:abstractNum w:abstractNumId="0" w15:restartNumberingAfterBreak="0">
     <w:nsid w:val="039E62F8"/>
     <w:multiLevelType w:val="hybridMultilevel"/>

</xml_diff>